<commit_message>
Fix DFS Weezy spelling
</commit_message>
<xml_diff>
--- a/UFC Freedom 250 Research.docx
+++ b/UFC Freedom 250 Research.docx
@@ -260,7 +260,7 @@
           <w:color w:val="1A1A1A"/>
           <w:sz w:val="28"/>
         </w:rPr>
-        <w:t>DFS Wheezy</w:t>
+        <w:t>DFS Weezy</w:t>
       </w:r>
     </w:p>
     <w:p>
@@ -626,7 +626,7 @@
           <w:color w:val="1A1A1A"/>
           <w:sz w:val="24"/>
         </w:rPr>
-        <w:t xml:space="preserve">DFS Wheezy picked Souza by decision, but his preferred betting angle was Souza inside distance near plus money rather than paying the worse decision price. His handicap was that Souza is younger, more live in wrestling/sub grappling, and in a better career phase while </w:t>
+        <w:t xml:space="preserve">DFS Weezy picked Souza by decision, but his preferred betting angle was Souza inside distance near plus money rather than paying the worse decision price. His handicap was that Souza is younger, more live in wrestling/sub grappling, and in a better career phase while </w:t>
       </w:r>
       <w:proofErr w:type="spellStart"/>
       <w:r>
@@ -1130,7 +1130,7 @@
           <w:color w:val="1A1A1A"/>
           <w:sz w:val="28"/>
         </w:rPr>
-        <w:t>DFS Wheezy</w:t>
+        <w:t>DFS Weezy</w:t>
       </w:r>
     </w:p>
     <w:p>
@@ -1416,7 +1416,7 @@
           <w:color w:val="1A1A1A"/>
           <w:sz w:val="24"/>
         </w:rPr>
-        <w:t xml:space="preserve">DFS Wheezy picked Brito by round-two knockout, liked Brito ITD around +160, and also noted Leavitt decision as the live alternate if the favorite fights low-IQ. Brito </w:t>
+        <w:t xml:space="preserve">DFS Weezy picked Brito by round-two knockout, liked Brito ITD around +160, and also noted Leavitt decision as the live alternate if the favorite fights low-IQ. Brito </w:t>
       </w:r>
       <w:proofErr w:type="spellStart"/>
       <w:r>
@@ -1940,7 +1940,7 @@
           <w:color w:val="1A1A1A"/>
           <w:sz w:val="28"/>
         </w:rPr>
-        <w:t>DFS Wheezy</w:t>
+        <w:t>DFS Weezy</w:t>
       </w:r>
     </w:p>
     <w:p>
@@ -2343,7 +2343,7 @@
           <w:color w:val="1A1A1A"/>
           <w:sz w:val="24"/>
         </w:rPr>
-        <w:t xml:space="preserve">DFS Wheezy picked Chaves by decision but said the fight is closer than the </w:t>
+        <w:t xml:space="preserve">DFS Weezy picked Chaves by decision but said the fight is closer than the </w:t>
       </w:r>
       <w:proofErr w:type="spellStart"/>
       <w:r>
@@ -2870,7 +2870,7 @@
           <w:color w:val="1A1A1A"/>
           <w:sz w:val="28"/>
         </w:rPr>
-        <w:t>DFS Wheezy</w:t>
+        <w:t>DFS Weezy</w:t>
       </w:r>
     </w:p>
     <w:p>
@@ -2952,7 +2952,7 @@
           <w:color w:val="1A1A1A"/>
           <w:sz w:val="24"/>
         </w:rPr>
-        <w:t>DFS Wheezy picked Cachoeira by decision and made her his dog pick of the week, but still treated it as low-trust. Chandler's path is clinch, wrestling, top time, and ground-and-pound; Cachoeira's path is cleaner distance damage if Chandler cannot or will not wrestle.</w:t>
+        <w:t>DFS Weezy picked Cachoeira by decision and made her his dog pick of the week, but still treated it as low-trust. Chandler's path is clinch, wrestling, top time, and ground-and-pound; Cachoeira's path is cleaner distance damage if Chandler cannot or will not wrestle.</w:t>
       </w:r>
     </w:p>
     <w:p>
@@ -3335,7 +3335,7 @@
           <w:color w:val="1A1A1A"/>
           <w:sz w:val="28"/>
         </w:rPr>
-        <w:t>DFS Wheezy</w:t>
+        <w:t>DFS Weezy</w:t>
       </w:r>
     </w:p>
     <w:p>
@@ -3417,7 +3417,7 @@
           <w:color w:val="1A1A1A"/>
           <w:sz w:val="24"/>
         </w:rPr>
-        <w:t>DFS Wheezy had no action but picked McGhee by late knockout, likely round three. He expects both men to get the striking fight they want, but McGhee has proven himself over rounds against Jonathan Martinez and Petr Yan-level striking while Yannis is taking a major short-notice step up.</w:t>
+        <w:t>DFS Weezy had no action but picked McGhee by late knockout, likely round three. He expects both men to get the striking fight they want, but McGhee has proven himself over rounds against Jonathan Martinez and Petr Yan-level striking while Yannis is taking a major short-notice step up.</w:t>
       </w:r>
     </w:p>
     <w:p>
@@ -3754,7 +3754,7 @@
           <w:color w:val="1A1A1A"/>
           <w:sz w:val="28"/>
         </w:rPr>
-        <w:t>DFS Wheezy</w:t>
+        <w:t>DFS Weezy</w:t>
       </w:r>
     </w:p>
     <w:p>
@@ -3836,7 +3836,7 @@
           <w:color w:val="1A1A1A"/>
           <w:sz w:val="24"/>
         </w:rPr>
-        <w:t>DFS Wheezy picked Costa by round-two submission and liked the Costa sub price around +525. He also mentioned starts-round-two/over looks and Schnell decision around +500 as contrarian paths because Costa can be patient and low-volume if he does not force the early finish.</w:t>
+        <w:t>DFS Weezy picked Costa by round-two submission and liked the Costa sub price around +525. He also mentioned starts-round-two/over looks and Schnell decision around +500 as contrarian paths because Costa can be patient and low-volume if he does not force the early finish.</w:t>
       </w:r>
     </w:p>
     <w:p>
@@ -4184,7 +4184,7 @@
           <w:color w:val="1A1A1A"/>
           <w:sz w:val="28"/>
         </w:rPr>
-        <w:t>DFS Wheezy</w:t>
+        <w:t>DFS Weezy</w:t>
       </w:r>
     </w:p>
     <w:p>
@@ -4424,7 +4424,7 @@
           <w:color w:val="1A1A1A"/>
           <w:sz w:val="24"/>
         </w:rPr>
-        <w:t xml:space="preserve">DFS Wheezy picked Mitchell by decision and made Mitchell </w:t>
+        <w:t xml:space="preserve">DFS Weezy picked Mitchell by decision and made Mitchell </w:t>
       </w:r>
       <w:proofErr w:type="spellStart"/>
       <w:r>
@@ -4973,7 +4973,7 @@
           <w:sz w:val="28"/>
         </w:rPr>
         <w:lastRenderedPageBreak/>
-        <w:t>DFS Wheezy</w:t>
+        <w:t>DFS Weezy</w:t>
       </w:r>
     </w:p>
     <w:p>
@@ -5575,7 +5575,7 @@
           <w:color w:val="1A1A1A"/>
           <w:sz w:val="24"/>
         </w:rPr>
-        <w:t xml:space="preserve">DFS Wheezy made </w:t>
+        <w:t xml:space="preserve">DFS Weezy made </w:t>
       </w:r>
       <w:proofErr w:type="spellStart"/>
       <w:r>
@@ -6483,7 +6483,7 @@
           <w:color w:val="1A1A1A"/>
           <w:sz w:val="28"/>
         </w:rPr>
-        <w:t>DFS Wheezy</w:t>
+        <w:t>DFS Weezy</w:t>
       </w:r>
     </w:p>
     <w:p>
@@ -6951,7 +6951,7 @@
           <w:color w:val="1A1A1A"/>
           <w:sz w:val="24"/>
         </w:rPr>
-        <w:t xml:space="preserve">DFS Wheezy liked under 1.5 as a parlay piece, picked </w:t>
+        <w:t xml:space="preserve">DFS Weezy liked under 1.5 as a parlay piece, picked </w:t>
       </w:r>
       <w:proofErr w:type="spellStart"/>
       <w:r>
@@ -7582,7 +7582,7 @@
           <w:color w:val="1A1A1A"/>
           <w:sz w:val="28"/>
         </w:rPr>
-        <w:t>DFS Wheezy</w:t>
+        <w:t>DFS Weezy</w:t>
       </w:r>
     </w:p>
     <w:p>
@@ -7913,7 +7913,7 @@
           <w:color w:val="1A1A1A"/>
           <w:sz w:val="24"/>
         </w:rPr>
-        <w:t>DFS Wheezy was more contrarian on the market shape: he picked Allen by decision and played fight-goes at +180 because he thinks Shahbazyan's takedown defense has improved enough to avoid immediate domination. He still sees Allen as the winner, with late grappling success but not necessarily a finish.</w:t>
+        <w:t>DFS Weezy was more contrarian on the market shape: he picked Allen by decision and played fight-goes at +180 because he thinks Shahbazyan's takedown defense has improved enough to avoid immediate domination. He still sees Allen as the winner, with late grappling success but not necessarily a finish.</w:t>
       </w:r>
     </w:p>
     <w:p>
@@ -8397,7 +8397,7 @@
           <w:color w:val="1A1A1A"/>
           <w:sz w:val="28"/>
         </w:rPr>
-        <w:t>DFS Wheezy</w:t>
+        <w:t>DFS Weezy</w:t>
       </w:r>
     </w:p>
     <w:p>
@@ -8656,7 +8656,7 @@
           <w:color w:val="1A1A1A"/>
           <w:sz w:val="24"/>
         </w:rPr>
-        <w:t>DFS Wheezy picked Silva by decision but also had a small Chairez knockout bet because Silva has been knocked out at the UFC level. Silva decision was one leg of his long-shot cycle parlay, while Chairez KO remains the hedge against Silva's chin and age.</w:t>
+        <w:t>DFS Weezy picked Silva by decision but also had a small Chairez knockout bet because Silva has been knocked out at the UFC level. Silva decision was one leg of his long-shot cycle parlay, while Chairez KO remains the hedge against Silva's chin and age.</w:t>
       </w:r>
     </w:p>
     <w:p>
@@ -9058,7 +9058,7 @@
           <w:color w:val="1A1A1A"/>
           <w:sz w:val="28"/>
         </w:rPr>
-        <w:t>DFS Wheezy</w:t>
+        <w:t>DFS Weezy</w:t>
       </w:r>
     </w:p>
     <w:p>
@@ -9384,7 +9384,7 @@
           <w:color w:val="1A1A1A"/>
           <w:sz w:val="24"/>
         </w:rPr>
-        <w:t xml:space="preserve">DFS Wheezy picked Muhammad by round-five knockout, played the </w:t>
+        <w:t xml:space="preserve">DFS Weezy picked Muhammad by round-five knockout, played the </w:t>
       </w:r>
       <w:proofErr w:type="spellStart"/>
       <w:r>
@@ -9779,7 +9779,7 @@
           <w:color w:val="1A1A1A"/>
           <w:sz w:val="28"/>
         </w:rPr>
-        <w:t>DFS Wheezy</w:t>
+        <w:t>DFS Weezy</w:t>
       </w:r>
     </w:p>
     <w:p>
@@ -9804,7 +9804,7 @@
           <w:color w:val="1A1A1A"/>
           <w:sz w:val="24"/>
         </w:rPr>
-        <w:t>Video: DFS Wheezy: UFC Vegas 118 Deep Dive | ID: Hn9Jm6RZN8I | URL: https://www.youtube.com/watch?v=Hn9Jm6RZN8I | No YouTube chapters; ranges are transcript-derived and match the original DFS Wheezy source ranges used in the notes.</w:t>
+        <w:t>Video: DFS Weezy: UFC Vegas 118 Deep Dive | ID: Hn9Jm6RZN8I | URL: https://www.youtube.com/watch?v=Hn9Jm6RZN8I | No YouTube chapters; ranges are transcript-derived and match the original DFS Weezy source ranges used in the notes.</w:t>
       </w:r>
     </w:p>
     <w:p>

</xml_diff>